<commit_message>
Aggiunta pattern nelle documentazioni
</commit_message>
<xml_diff>
--- a/designPattern/Prototype/Documentazione Prototype Pattern.docx
+++ b/designPattern/Prototype/Documentazione Prototype Pattern.docx
@@ -16,35 +16,27 @@
           <w:sz w:val="32"/>
           <w:szCs w:val="32"/>
         </w:rPr>
-        <w:t>Documentazione Prototype Pattern</w:t>
-      </w:r>
-    </w:p>
-    <w:p>
+        <w:t xml:space="preserve">Documentazione </w:t>
+      </w:r>
+      <w:proofErr w:type="spellStart"/>
       <w:r>
         <w:rPr>
           <w:b/>
           <w:bCs/>
-        </w:rPr>
-        <w:t>Cos e il Prototype</w:t>
-      </w:r>
-    </w:p>
-    <w:p>
-      <w:r>
-        <w:t>Il Prototype Pattern è un pattern creazionale che permette di creare nuovi oggetti copiando un oggetto esistente, chiamato prototipo. Invece di costruire ogni istanza da zero, il client chiede una copia del modello già pronto.</w:t>
-      </w:r>
-    </w:p>
-    <w:p>
+          <w:sz w:val="32"/>
+          <w:szCs w:val="32"/>
+        </w:rPr>
+        <w:t>Prototype</w:t>
+      </w:r>
+      <w:proofErr w:type="spellEnd"/>
       <w:r>
         <w:rPr>
           <w:b/>
           <w:bCs/>
-        </w:rPr>
-        <w:t>Idea chiave</w:t>
-      </w:r>
-    </w:p>
-    <w:p>
-      <w:r>
-        <w:t>L’idea centrale è semplice: se hai un oggetto già configurato, puoi duplicarlo e poi modificare solo le parti che cambiano. Questo è utile quando la costruzione è costosa o quando vuoi creare oggetti molto simili tra loro.</w:t>
+          <w:sz w:val="32"/>
+          <w:szCs w:val="32"/>
+        </w:rPr>
+        <w:t xml:space="preserve"> Pattern</w:t>
       </w:r>
     </w:p>
     <w:p>
@@ -53,26 +45,29 @@
           <w:b/>
           <w:bCs/>
         </w:rPr>
-        <w:t>Ruoli del pattern</w:t>
-      </w:r>
-    </w:p>
-    <w:p>
-      <w:r>
-        <w:t>Prototype: definisce l’operazione di copia. ConcretePrototype: implementa la clonazione. Client: usa il prototipo per ottenere nuove istanze.</w:t>
-      </w:r>
-    </w:p>
-    <w:p>
+        <w:t xml:space="preserve">Cos e il </w:t>
+      </w:r>
+      <w:proofErr w:type="spellStart"/>
       <w:r>
         <w:rPr>
           <w:b/>
           <w:bCs/>
         </w:rPr>
-        <w:t>Shallow e deep copy</w:t>
-      </w:r>
-    </w:p>
-    <w:p>
-      <w:r>
-        <w:t>Con shallow copy copi l’oggetto ma non gli oggetti interni, quindi alcune parti restano condivise. Con deep copy copi anche gli oggetti interni e ottieni una copia totalmente indipendente.</w:t>
+        <w:t>Prototype</w:t>
+      </w:r>
+      <w:proofErr w:type="spellEnd"/>
+    </w:p>
+    <w:p>
+      <w:r>
+        <w:t xml:space="preserve">Il </w:t>
+      </w:r>
+      <w:proofErr w:type="spellStart"/>
+      <w:r>
+        <w:t>Prototype</w:t>
+      </w:r>
+      <w:proofErr w:type="spellEnd"/>
+      <w:r>
+        <w:t xml:space="preserve"> Pattern è un pattern creazionale che permette di creare nuovi oggetti copiando un oggetto esistente, chiamato prototipo. Invece di costruire ogni istanza da zero, il client chiede una copia del modello già pronto.</w:t>
       </w:r>
     </w:p>
     <w:p>
@@ -81,15 +76,12 @@
           <w:b/>
           <w:bCs/>
         </w:rPr>
-        <w:t>Quando usarlo</w:t>
-      </w:r>
-    </w:p>
-    <w:p>
-      <w:r>
-        <w:t>Va usato</w:t>
-      </w:r>
-      <w:r>
-        <w:t xml:space="preserve"> quando creare l’oggetto da zero è complesso, quando il sistema ha molte varianti simili oppure quando vuoi evitare di conoscere tutte le classi concrete.</w:t>
+        <w:t>Idea chiave</w:t>
+      </w:r>
+    </w:p>
+    <w:p>
+      <w:r>
+        <w:t>L’idea centrale è semplice: se hai un oggetto già configurato, puoi duplicarlo e poi modificare solo le parti che cambiano. Questo è utile quando la costruzione è costosa o quando vuoi creare oggetti molto simili tra loro.</w:t>
       </w:r>
     </w:p>
     <w:p>
@@ -98,12 +90,25 @@
           <w:b/>
           <w:bCs/>
         </w:rPr>
-        <w:t>Vantaggi</w:t>
-      </w:r>
-    </w:p>
-    <w:p>
-      <w:r>
-        <w:t>Riduce il codice di costruzione, velocizza la creazione degli oggetti e rende più semplice generare copie di configurazioni già pronte.</w:t>
+        <w:t>Ruoli del pattern</w:t>
+      </w:r>
+    </w:p>
+    <w:p>
+      <w:proofErr w:type="spellStart"/>
+      <w:r>
+        <w:t>Prototype</w:t>
+      </w:r>
+      <w:proofErr w:type="spellEnd"/>
+      <w:r>
+        <w:t xml:space="preserve">: definisce l’operazione di copia. </w:t>
+      </w:r>
+      <w:proofErr w:type="spellStart"/>
+      <w:r>
+        <w:t>ConcretePrototype</w:t>
+      </w:r>
+      <w:proofErr w:type="spellEnd"/>
+      <w:r>
+        <w:t>: implementa la clonazione. Client: usa il prototipo per ottenere nuove istanze.</w:t>
       </w:r>
     </w:p>
     <w:p>
@@ -112,12 +117,20 @@
           <w:b/>
           <w:bCs/>
         </w:rPr>
-        <w:t>Limiti</w:t>
-      </w:r>
-    </w:p>
-    <w:p>
-      <w:r>
-        <w:t>Può diventare delicato se l’oggetto contiene molti riferimenti interni. Se il clone non è implementato bene, rischi copie incomplete o con oggetti condivisi in modo indesiderato.</w:t>
+        <w:t>Shallow e deep copy</w:t>
+      </w:r>
+    </w:p>
+    <w:p>
+      <w:r>
+        <w:t xml:space="preserve">Con </w:t>
+      </w:r>
+      <w:proofErr w:type="spellStart"/>
+      <w:r>
+        <w:t>shallow</w:t>
+      </w:r>
+      <w:proofErr w:type="spellEnd"/>
+      <w:r>
+        <w:t xml:space="preserve"> copy copi l’oggetto ma non gli oggetti interni, quindi alcune parti restano condivise. Con deep copy copi anche gli oggetti interni e ottieni una copia totalmente indipendente.</w:t>
       </w:r>
     </w:p>
     <w:p>
@@ -126,12 +139,65 @@
           <w:b/>
           <w:bCs/>
         </w:rPr>
+        <w:t>Quando usarlo</w:t>
+      </w:r>
+    </w:p>
+    <w:p>
+      <w:r>
+        <w:t>Va usato</w:t>
+      </w:r>
+      <w:r>
+        <w:t xml:space="preserve"> quando creare l’oggetto da zero è complesso, quando il sistema ha molte varianti simili oppure quando vuoi evitare di conoscere tutte le classi concrete.</w:t>
+      </w:r>
+    </w:p>
+    <w:p>
+      <w:r>
+        <w:rPr>
+          <w:b/>
+          <w:bCs/>
+        </w:rPr>
+        <w:t>Vantaggi</w:t>
+      </w:r>
+    </w:p>
+    <w:p>
+      <w:r>
+        <w:t>Riduce il codice di costruzione, velocizza la creazione degli oggetti e rende più semplice generare copie di configurazioni già pronte.</w:t>
+      </w:r>
+    </w:p>
+    <w:p>
+      <w:r>
+        <w:rPr>
+          <w:b/>
+          <w:bCs/>
+        </w:rPr>
+        <w:t>Limiti</w:t>
+      </w:r>
+    </w:p>
+    <w:p>
+      <w:r>
+        <w:t>Può diventare delicato se l’oggetto contiene molti riferimenti interni. Se il clone non è implementato bene, rischi copie incomplete o con oggetti condivisi in modo indesiderato.</w:t>
+      </w:r>
+    </w:p>
+    <w:p>
+      <w:r>
+        <w:rPr>
+          <w:b/>
+          <w:bCs/>
+        </w:rPr>
         <w:t>In breve</w:t>
       </w:r>
     </w:p>
     <w:p>
       <w:r>
-        <w:t>Il Prototype è il pattern giusto quando il problema principale non è creare un tipo nuovo, ma duplicare rapidamente uno stato già pronto.</w:t>
+        <w:t xml:space="preserve">Il </w:t>
+      </w:r>
+      <w:proofErr w:type="spellStart"/>
+      <w:r>
+        <w:t>Prototype</w:t>
+      </w:r>
+      <w:proofErr w:type="spellEnd"/>
+      <w:r>
+        <w:t xml:space="preserve"> è il pattern giusto quando il problema principale non è creare un tipo nuovo, ma duplicare rapidamente uno stato già pronto.</w:t>
       </w:r>
     </w:p>
     <w:p>
@@ -158,8 +224,21 @@
           <w:numId w:val="1"/>
         </w:numPr>
       </w:pPr>
-      <w:r>
-        <w:t>Prototype è l’interfaccia che definisce il metodo clone().</w:t>
+      <w:proofErr w:type="spellStart"/>
+      <w:r>
+        <w:t>Prototype</w:t>
+      </w:r>
+      <w:proofErr w:type="spellEnd"/>
+      <w:r>
+        <w:t xml:space="preserve"> è l’interfaccia che definisce il metodo </w:t>
+      </w:r>
+      <w:proofErr w:type="gramStart"/>
+      <w:r>
+        <w:t>clone(</w:t>
+      </w:r>
+      <w:proofErr w:type="gramEnd"/>
+      <w:r>
+        <w:t>).</w:t>
       </w:r>
     </w:p>
     <w:p>
@@ -272,10 +351,31 @@
         <w:pStyle w:val="Paragrafoelenco"/>
       </w:pPr>
       <w:r>
-        <w:t>Nel metodo clone() ritorniamo un nuovo Point2D con gli stessi valori, quindi il nuovo oggetto parte dallo stesso stato del prototipo.</w:t>
-      </w:r>
-      <w:r>
-        <w:t xml:space="preserve"> I metodi get() li ho inseriti nel caso volessimo creare un’altra classe che copia il nostro prototipo in modo da passare i parametri.</w:t>
+        <w:t xml:space="preserve">Nel metodo </w:t>
+      </w:r>
+      <w:proofErr w:type="gramStart"/>
+      <w:r>
+        <w:t>clone(</w:t>
+      </w:r>
+      <w:proofErr w:type="gramEnd"/>
+      <w:r>
+        <w:t>) ritorniamo un nuovo Point2D con gli stessi valori, quindi il nuovo oggetto parte dallo stesso stato del prototipo.</w:t>
+      </w:r>
+      <w:r>
+        <w:t xml:space="preserve"> I metodi </w:t>
+      </w:r>
+      <w:proofErr w:type="spellStart"/>
+      <w:proofErr w:type="gramStart"/>
+      <w:r>
+        <w:t>get</w:t>
+      </w:r>
+      <w:proofErr w:type="spellEnd"/>
+      <w:r>
+        <w:t>(</w:t>
+      </w:r>
+      <w:proofErr w:type="gramEnd"/>
+      <w:r>
+        <w:t>) li ho inseriti nel caso volessimo creare un’altra classe che copia il nostro prototipo in modo da passare i parametri.</w:t>
       </w:r>
     </w:p>
     <w:p>
@@ -292,7 +392,15 @@
         </w:numPr>
       </w:pPr>
       <w:r>
-        <w:t>Client crea un oggetto originale e poi ne ottiene una copia chiamando clone().</w:t>
+        <w:t xml:space="preserve">Client crea un oggetto originale e poi ne ottiene una copia chiamando </w:t>
+      </w:r>
+      <w:proofErr w:type="gramStart"/>
+      <w:r>
+        <w:t>clone(</w:t>
+      </w:r>
+      <w:proofErr w:type="gramEnd"/>
+      <w:r>
+        <w:t>).</w:t>
       </w:r>
     </w:p>
     <w:p>
@@ -381,6 +489,62 @@
                     <a:xfrm>
                       <a:off x="0" y="0"/>
                       <a:ext cx="1501270" cy="342930"/>
+                    </a:xfrm>
+                    <a:prstGeom prst="rect">
+                      <a:avLst/>
+                    </a:prstGeom>
+                  </pic:spPr>
+                </pic:pic>
+              </a:graphicData>
+            </a:graphic>
+          </wp:inline>
+        </w:drawing>
+      </w:r>
+    </w:p>
+    <w:p>
+      <w:pPr>
+        <w:pStyle w:val="Paragrafoelenco"/>
+        <w:rPr>
+          <w:u w:val="single"/>
+        </w:rPr>
+      </w:pPr>
+      <w:r>
+        <w:rPr>
+          <w:noProof/>
+          <w:u w:val="single"/>
+        </w:rPr>
+        <w:lastRenderedPageBreak/>
+        <w:drawing>
+          <wp:inline distT="0" distB="0" distL="0" distR="0" wp14:anchorId="66D5A7C4" wp14:editId="41731594">
+            <wp:extent cx="6125430" cy="6906589"/>
+            <wp:effectExtent l="0" t="0" r="8890" b="8890"/>
+            <wp:docPr id="1322154088" name="Immagine 1"/>
+            <wp:cNvGraphicFramePr>
+              <a:graphicFrameLocks xmlns:a="http://schemas.openxmlformats.org/drawingml/2006/main" noChangeAspect="1"/>
+            </wp:cNvGraphicFramePr>
+            <a:graphic xmlns:a="http://schemas.openxmlformats.org/drawingml/2006/main">
+              <a:graphicData uri="http://schemas.openxmlformats.org/drawingml/2006/picture">
+                <pic:pic xmlns:pic="http://schemas.openxmlformats.org/drawingml/2006/picture">
+                  <pic:nvPicPr>
+                    <pic:cNvPr id="1322154088" name="Immagine 1322154088"/>
+                    <pic:cNvPicPr/>
+                  </pic:nvPicPr>
+                  <pic:blipFill>
+                    <a:blip r:embed="rId10">
+                      <a:extLst>
+                        <a:ext uri="{28A0092B-C50C-407E-A947-70E740481C1C}">
+                          <a14:useLocalDpi xmlns:a14="http://schemas.microsoft.com/office/drawing/2010/main" val="0"/>
+                        </a:ext>
+                      </a:extLst>
+                    </a:blip>
+                    <a:stretch>
+                      <a:fillRect/>
+                    </a:stretch>
+                  </pic:blipFill>
+                  <pic:spPr>
+                    <a:xfrm>
+                      <a:off x="0" y="0"/>
+                      <a:ext cx="6125430" cy="6906589"/>
                     </a:xfrm>
                     <a:prstGeom prst="rect">
                       <a:avLst/>

</xml_diff>